<commit_message>
Include full Tomcat configuration in report
</commit_message>
<xml_diff>
--- a/docs/Opash_4314_lab6.docx
+++ b/docs/Opash_4314_lab6.docx
@@ -1148,7 +1148,7 @@
         <w:rPr>
           <w:rFonts w:ascii="Times New Roman" w:hAnsi="Times New Roman"/>
         </w:rPr>
-        <w:t>Приложение В. Настройка HTTPS в файле server.xml</w:t>
+        <w:t>Приложение В. Файл server.xml</w:t>
       </w:r>
     </w:p>
     <w:p>
@@ -1164,7 +1164,7 @@
         <w:rPr>
           <w:rFonts w:ascii="Times New Roman" w:hAnsi="Times New Roman"/>
         </w:rPr>
-        <w:t>conf/server.xml, HTTP- и HTTPS-коннекторы</w:t>
+        <w:t>conf/server.xml</w:t>
       </w:r>
     </w:p>
     <w:p>
@@ -1181,6 +1181,163 @@
           <w:rFonts w:ascii="Times New Roman" w:hAnsi="Times New Roman"/>
           <w:sz w:val="19"/>
         </w:rPr>
+        <w:t>&lt;?xml version="1.0" encoding="UTF-8"?&gt;</w:t>
+        <w:br/>
+        <w:t>&lt;!--</w:t>
+        <w:br/>
+        <w:t xml:space="preserve">  Licensed to the Apache Software Foundation (ASF) under one or more</w:t>
+        <w:br/>
+        <w:t xml:space="preserve">  contributor license agreements.  See the NOTICE file distributed with</w:t>
+        <w:br/>
+        <w:t xml:space="preserve">  this work for additional information regarding copyright ownership.</w:t>
+        <w:br/>
+        <w:t xml:space="preserve">  The ASF licenses this file to You under the Apache License, Version 2.0</w:t>
+        <w:br/>
+        <w:t xml:space="preserve">  (the "License"); you may not use this file except in compliance with</w:t>
+        <w:br/>
+        <w:t xml:space="preserve">  the License.  You may obtain a copy of the License at</w:t>
+        <w:br/>
+        <w:br/>
+        <w:t xml:space="preserve">      http://www.apache.org/licenses/LICENSE-2.0</w:t>
+        <w:br/>
+        <w:br/>
+        <w:t xml:space="preserve">  Unless required by applicable law or agreed to in writing, software</w:t>
+        <w:br/>
+        <w:t xml:space="preserve">  distributed under the License is distributed on an "AS IS" BASIS,</w:t>
+        <w:br/>
+        <w:t xml:space="preserve">  WITHOUT WARRANTIES OR CONDITIONS OF ANY KIND, either express or implied.</w:t>
+        <w:br/>
+        <w:t xml:space="preserve">  See the License for the specific language governing permissions and</w:t>
+        <w:br/>
+        <w:t xml:space="preserve">  limitations under the License.</w:t>
+        <w:br/>
+        <w:t>--&gt;&lt;!-- Note:  A "Server" is not itself a "Container", so you may not</w:t>
+        <w:br/>
+        <w:t xml:space="preserve">     define subcomponents such as "Valves" at this level.</w:t>
+        <w:br/>
+        <w:t xml:space="preserve">     Documentation at /docs/config/server.html</w:t>
+        <w:br/>
+        <w:t xml:space="preserve"> --&gt;&lt;Server port="8005" shutdown="SHUTDOWN"&gt;</w:t>
+        <w:br/>
+        <w:t xml:space="preserve">  &lt;Listener className="org.apache.catalina.startup.VersionLoggerListener"/&gt;</w:t>
+        <w:br/>
+        <w:t xml:space="preserve">  &lt;!-- Security listener. Documentation at /docs/config/listeners.html</w:t>
+        <w:br/>
+        <w:t xml:space="preserve">  &lt;Listener className="org.apache.catalina.security.SecurityListener" /&gt;</w:t>
+        <w:br/>
+        <w:t xml:space="preserve">  --&gt;</w:t>
+        <w:br/>
+        <w:t xml:space="preserve">  &lt;!-- APR connector and OpenSSL support using Tomcat Native --&gt;</w:t>
+        <w:br/>
+        <w:t xml:space="preserve">  &lt;Listener className="org.apache.catalina.core.AprLifecycleListener"/&gt;</w:t>
+        <w:br/>
+        <w:t xml:space="preserve">  &lt;!-- OpenSSL support using FFM API from Java 22 --&gt;</w:t>
+        <w:br/>
+        <w:t xml:space="preserve">  &lt;!-- &lt;Listener className="org.apache.catalina.core.OpenSSLLifecycleListener" /&gt; --&gt;</w:t>
+        <w:br/>
+        <w:t xml:space="preserve">  &lt;!-- Prevent memory leaks due to use of particular java/javax APIs--&gt;</w:t>
+        <w:br/>
+        <w:t xml:space="preserve">  &lt;Listener className="org.apache.catalina.core.JreMemoryLeakPreventionListener"/&gt;</w:t>
+        <w:br/>
+        <w:t xml:space="preserve">  &lt;Listener className="org.apache.catalina.mbeans.GlobalResourcesLifecycleListener"/&gt;</w:t>
+        <w:br/>
+        <w:t xml:space="preserve">  &lt;Listener className="org.apache.catalina.core.ThreadLocalLeakPreventionListener"/&gt;</w:t>
+        <w:br/>
+        <w:br/>
+        <w:t xml:space="preserve">  &lt;!-- Global JNDI resources</w:t>
+      </w:r>
+    </w:p>
+    <w:p>
+      <w:pPr>
+        <w:pStyle w:val="1"/>
+        <w:pageBreakBefore/>
+        <w:spacing w:before="280" w:after="120"/>
+      </w:pPr>
+      <w:r>
+        <w:rPr>
+          <w:rFonts w:ascii="Times New Roman" w:hAnsi="Times New Roman"/>
+        </w:rPr>
+        <w:t>Приложение В. Файл server.xml (продолжение)</w:t>
+      </w:r>
+    </w:p>
+    <w:p>
+      <w:pPr>
+        <w:spacing w:after="120"/>
+        <w:ind w:firstLine="567"/>
+        <w:jc w:val="both"/>
+        <w:rPr>
+          <w:lang w:val="ru-RU"/>
+        </w:rPr>
+      </w:pPr>
+      <w:r>
+        <w:rPr>
+          <w:rFonts w:ascii="Times New Roman" w:hAnsi="Times New Roman"/>
+        </w:rPr>
+        <w:t>conf/server.xml</w:t>
+      </w:r>
+    </w:p>
+    <w:p>
+      <w:pPr>
+        <w:spacing w:after="120" w:line="240" w:lineRule="auto"/>
+        <w:ind w:firstLine="0"/>
+        <w:jc w:val="left"/>
+        <w:rPr>
+          <w:lang w:val="ru-RU"/>
+        </w:rPr>
+      </w:pPr>
+      <w:r>
+        <w:rPr>
+          <w:rFonts w:ascii="Times New Roman" w:hAnsi="Times New Roman"/>
+          <w:sz w:val="19"/>
+        </w:rPr>
+        <w:t xml:space="preserve">       Documentation at /docs/jndi-resources-howto.html</w:t>
+        <w:br/>
+        <w:t xml:space="preserve">  --&gt;</w:t>
+        <w:br/>
+        <w:t xml:space="preserve">  &lt;GlobalNamingResources&gt;</w:t>
+        <w:br/>
+        <w:t xml:space="preserve">    &lt;!-- Editable user database that can also be used by</w:t>
+        <w:br/>
+        <w:t xml:space="preserve">         UserDatabaseRealm to authenticate users</w:t>
+        <w:br/>
+        <w:t xml:space="preserve">    --&gt;</w:t>
+        <w:br/>
+        <w:t xml:space="preserve">    &lt;Resource auth="Container" description="User database that can be updated and saved" factory="org.apache.catalina.users.MemoryUserDatabaseFactory" name="UserDatabase" pathname="conf/tomcat-users.xml" type="org.apache.catalina.UserDatabase"/&gt;</w:t>
+        <w:br/>
+        <w:t xml:space="preserve">  &lt;/GlobalNamingResources&gt;</w:t>
+        <w:br/>
+        <w:br/>
+        <w:t xml:space="preserve">  &lt;!-- A "Service" is a collection of one or more "Connectors" that share</w:t>
+        <w:br/>
+        <w:t xml:space="preserve">       a single "Container" Note:  A "Service" is not itself a "Container",</w:t>
+        <w:br/>
+        <w:t xml:space="preserve">       so you may not define subcomponents such as "Valves" at this level.</w:t>
+        <w:br/>
+        <w:t xml:space="preserve">       Documentation at /docs/config/service.html</w:t>
+        <w:br/>
+        <w:t xml:space="preserve">   --&gt;</w:t>
+        <w:br/>
+        <w:t xml:space="preserve">  &lt;Service name="Catalina"&gt;</w:t>
+        <w:br/>
+        <w:br/>
+        <w:t xml:space="preserve">    &lt;!--The connectors can use a shared executor, you can define one or more named thread pools--&gt;</w:t>
+        <w:br/>
+        <w:t xml:space="preserve">    &lt;!--</w:t>
+        <w:br/>
+        <w:t xml:space="preserve">    &lt;Executor name="tomcatThreadPool" namePrefix="catalina-exec-"</w:t>
+        <w:br/>
+        <w:t xml:space="preserve">        maxThreads="150" minSpareThreads="4"/&gt;</w:t>
+        <w:br/>
+        <w:t xml:space="preserve">    --&gt;</w:t>
+        <w:br/>
+        <w:br/>
+        <w:br/>
+        <w:t xml:space="preserve">    &lt;!-- A "Connector" represents an endpoint by which requests are received</w:t>
+        <w:br/>
+        <w:t xml:space="preserve">         and responses are returned. Documentation at :</w:t>
+        <w:br/>
+        <w:t xml:space="preserve">         Java HTTP Connector: /docs/config/http.html</w:t>
+        <w:br/>
         <w:t xml:space="preserve">         Java AJP  Connector: /docs/config/ajp.html</w:t>
         <w:br/>
         <w:t xml:space="preserve">         APR (HTTP/AJP) Connector: /docs/apr.html</w:t>
@@ -1196,7 +1353,51 @@
         <w:t xml:space="preserve">    &lt;!--</w:t>
         <w:br/>
         <w:t xml:space="preserve">    &lt;Connector executor="tomcatThreadPool"</w:t>
-        <w:br/>
+      </w:r>
+    </w:p>
+    <w:p>
+      <w:pPr>
+        <w:pStyle w:val="1"/>
+        <w:pageBreakBefore/>
+        <w:spacing w:before="280" w:after="120"/>
+      </w:pPr>
+      <w:r>
+        <w:rPr>
+          <w:rFonts w:ascii="Times New Roman" w:hAnsi="Times New Roman"/>
+        </w:rPr>
+        <w:t>Приложение В. Файл server.xml (продолжение)</w:t>
+      </w:r>
+    </w:p>
+    <w:p>
+      <w:pPr>
+        <w:spacing w:after="120"/>
+        <w:ind w:firstLine="567"/>
+        <w:jc w:val="both"/>
+        <w:rPr>
+          <w:lang w:val="ru-RU"/>
+        </w:rPr>
+      </w:pPr>
+      <w:r>
+        <w:rPr>
+          <w:rFonts w:ascii="Times New Roman" w:hAnsi="Times New Roman"/>
+        </w:rPr>
+        <w:t>conf/server.xml</w:t>
+      </w:r>
+    </w:p>
+    <w:p>
+      <w:pPr>
+        <w:spacing w:after="120" w:line="240" w:lineRule="auto"/>
+        <w:ind w:firstLine="0"/>
+        <w:jc w:val="left"/>
+        <w:rPr>
+          <w:lang w:val="ru-RU"/>
+        </w:rPr>
+      </w:pPr>
+      <w:r>
+        <w:rPr>
+          <w:rFonts w:ascii="Times New Roman" w:hAnsi="Times New Roman"/>
+          <w:sz w:val="19"/>
+        </w:rPr>
         <w:t xml:space="preserve">               port="8080" protocol="HTTP/1.1"</w:t>
         <w:br/>
         <w:t xml:space="preserve">               connectionTimeout="20000"</w:t>
@@ -1246,6 +1447,231 @@
         <w:t xml:space="preserve">         This connector uses the APR/native implementation which always uses</w:t>
         <w:br/>
         <w:t xml:space="preserve">         OpenSSL for TLS.</w:t>
+        <w:br/>
+        <w:t xml:space="preserve">         Either JSSE or OpenSSL style configuration may be used. OpenSSL style</w:t>
+        <w:br/>
+        <w:t xml:space="preserve">         configuration is used below.</w:t>
+        <w:br/>
+        <w:t xml:space="preserve">    --&gt;</w:t>
+        <w:br/>
+        <w:t xml:space="preserve">    &lt;!--</w:t>
+        <w:br/>
+        <w:t xml:space="preserve">    &lt;Connector port="8443" protocol="org.apache.coyote.http11.Http11AprProtocol"</w:t>
+        <w:br/>
+        <w:t xml:space="preserve">               maxThreads="150" SSLEnabled="true"</w:t>
+        <w:br/>
+        <w:t xml:space="preserve">               maxParameterCount="1000"</w:t>
+        <w:br/>
+        <w:t xml:space="preserve">               &gt;</w:t>
+        <w:br/>
+        <w:t xml:space="preserve">        &lt;UpgradeProtocol className="org.apache.coyote.http2.Http2Protocol" /&gt;</w:t>
+      </w:r>
+    </w:p>
+    <w:p>
+      <w:pPr>
+        <w:pStyle w:val="1"/>
+        <w:pageBreakBefore/>
+        <w:spacing w:before="280" w:after="120"/>
+      </w:pPr>
+      <w:r>
+        <w:rPr>
+          <w:rFonts w:ascii="Times New Roman" w:hAnsi="Times New Roman"/>
+        </w:rPr>
+        <w:t>Приложение В. Файл server.xml (продолжение)</w:t>
+      </w:r>
+    </w:p>
+    <w:p>
+      <w:pPr>
+        <w:spacing w:after="120"/>
+        <w:ind w:firstLine="567"/>
+        <w:jc w:val="both"/>
+        <w:rPr>
+          <w:lang w:val="ru-RU"/>
+        </w:rPr>
+      </w:pPr>
+      <w:r>
+        <w:rPr>
+          <w:rFonts w:ascii="Times New Roman" w:hAnsi="Times New Roman"/>
+        </w:rPr>
+        <w:t>conf/server.xml</w:t>
+      </w:r>
+    </w:p>
+    <w:p>
+      <w:pPr>
+        <w:spacing w:after="120" w:line="240" w:lineRule="auto"/>
+        <w:ind w:firstLine="0"/>
+        <w:jc w:val="left"/>
+        <w:rPr>
+          <w:lang w:val="ru-RU"/>
+        </w:rPr>
+      </w:pPr>
+      <w:r>
+        <w:rPr>
+          <w:rFonts w:ascii="Times New Roman" w:hAnsi="Times New Roman"/>
+          <w:sz w:val="19"/>
+        </w:rPr>
+        <w:t xml:space="preserve">        &lt;SSLHostConfig&gt;</w:t>
+        <w:br/>
+        <w:t xml:space="preserve">            &lt;Certificate certificateKeyFile="conf/localhost-rsa-key.pem"</w:t>
+        <w:br/>
+        <w:t xml:space="preserve">                         certificateFile="conf/localhost-rsa-cert.pem"</w:t>
+        <w:br/>
+        <w:t xml:space="preserve">                         certificateChainFile="conf/localhost-rsa-chain.pem"</w:t>
+        <w:br/>
+        <w:t xml:space="preserve">                         type="RSA" /&gt;</w:t>
+        <w:br/>
+        <w:t xml:space="preserve">        &lt;/SSLHostConfig&gt;</w:t>
+        <w:br/>
+        <w:t xml:space="preserve">    &lt;/Connector&gt;</w:t>
+        <w:br/>
+        <w:t xml:space="preserve">    --&gt;</w:t>
+        <w:br/>
+        <w:br/>
+        <w:t xml:space="preserve">    &lt;!-- Define an AJP 1.3 Connector on port 8009 --&gt;</w:t>
+        <w:br/>
+        <w:t xml:space="preserve">    &lt;!--</w:t>
+        <w:br/>
+        <w:t xml:space="preserve">    &lt;Connector protocol="AJP/1.3"</w:t>
+        <w:br/>
+        <w:t xml:space="preserve">               address="::1"</w:t>
+        <w:br/>
+        <w:t xml:space="preserve">               port="8009"</w:t>
+        <w:br/>
+        <w:t xml:space="preserve">               redirectPort="8443"</w:t>
+        <w:br/>
+        <w:t xml:space="preserve">               maxParameterCount="1000"</w:t>
+        <w:br/>
+        <w:t xml:space="preserve">               /&gt;</w:t>
+        <w:br/>
+        <w:t xml:space="preserve">    --&gt;</w:t>
+        <w:br/>
+        <w:br/>
+        <w:t xml:space="preserve">    &lt;!-- An Engine represents the entry point (within Catalina) that processes</w:t>
+        <w:br/>
+        <w:t xml:space="preserve">         every request.  The Engine implementation for Tomcat stand alone</w:t>
+        <w:br/>
+        <w:t xml:space="preserve">         analyzes the HTTP headers included with the request, and passes them</w:t>
+        <w:br/>
+        <w:t xml:space="preserve">         on to the appropriate Host (virtual host).</w:t>
+        <w:br/>
+        <w:t xml:space="preserve">         Documentation at /docs/config/engine.html --&gt;</w:t>
+        <w:br/>
+        <w:br/>
+        <w:t xml:space="preserve">    &lt;!-- You should set jvmRoute to support load-balancing via AJP ie :</w:t>
+        <w:br/>
+        <w:t xml:space="preserve">    &lt;Engine name="Catalina" defaultHost="localhost" jvmRoute="jvm1"&gt;</w:t>
+        <w:br/>
+        <w:t xml:space="preserve">    --&gt;</w:t>
+        <w:br/>
+        <w:t xml:space="preserve">    &lt;Engine defaultHost="localhost" name="Catalina"&gt;</w:t>
+        <w:br/>
+        <w:br/>
+        <w:t xml:space="preserve">      &lt;!--For clustering, please take a look at documentation at:</w:t>
+        <w:br/>
+        <w:t xml:space="preserve">          /docs/cluster-howto.html  (simple how to)</w:t>
+        <w:br/>
+        <w:t xml:space="preserve">          /docs/config/cluster.html (reference documentation) --&gt;</w:t>
+        <w:br/>
+        <w:t xml:space="preserve">      &lt;!--</w:t>
+      </w:r>
+    </w:p>
+    <w:p>
+      <w:pPr>
+        <w:pStyle w:val="1"/>
+        <w:pageBreakBefore/>
+        <w:spacing w:before="280" w:after="120"/>
+      </w:pPr>
+      <w:r>
+        <w:rPr>
+          <w:rFonts w:ascii="Times New Roman" w:hAnsi="Times New Roman"/>
+        </w:rPr>
+        <w:t>Приложение В. Файл server.xml (продолжение)</w:t>
+      </w:r>
+    </w:p>
+    <w:p>
+      <w:pPr>
+        <w:spacing w:after="120"/>
+        <w:ind w:firstLine="567"/>
+        <w:jc w:val="both"/>
+        <w:rPr>
+          <w:lang w:val="ru-RU"/>
+        </w:rPr>
+      </w:pPr>
+      <w:r>
+        <w:rPr>
+          <w:rFonts w:ascii="Times New Roman" w:hAnsi="Times New Roman"/>
+        </w:rPr>
+        <w:t>conf/server.xml</w:t>
+      </w:r>
+    </w:p>
+    <w:p>
+      <w:pPr>
+        <w:spacing w:after="120" w:line="240" w:lineRule="auto"/>
+        <w:ind w:firstLine="0"/>
+        <w:jc w:val="left"/>
+        <w:rPr>
+          <w:lang w:val="ru-RU"/>
+        </w:rPr>
+      </w:pPr>
+      <w:r>
+        <w:rPr>
+          <w:rFonts w:ascii="Times New Roman" w:hAnsi="Times New Roman"/>
+          <w:sz w:val="19"/>
+        </w:rPr>
+        <w:t xml:space="preserve">      &lt;Cluster className="org.apache.catalina.ha.tcp.SimpleTcpCluster"/&gt;</w:t>
+        <w:br/>
+        <w:t xml:space="preserve">      --&gt;</w:t>
+        <w:br/>
+        <w:br/>
+        <w:t xml:space="preserve">      &lt;!-- Use the LockOutRealm to prevent attempts to guess user passwords</w:t>
+        <w:br/>
+        <w:t xml:space="preserve">           via a brute-force attack --&gt;</w:t>
+        <w:br/>
+        <w:t xml:space="preserve">      &lt;Realm className="org.apache.catalina.realm.LockOutRealm"&gt;</w:t>
+        <w:br/>
+        <w:t xml:space="preserve">        &lt;!-- This Realm uses the UserDatabase configured in the global JNDI</w:t>
+        <w:br/>
+        <w:t xml:space="preserve">             resources under the key "UserDatabase".  Any edits</w:t>
+        <w:br/>
+        <w:t xml:space="preserve">             that are performed against this UserDatabase are immediately</w:t>
+        <w:br/>
+        <w:t xml:space="preserve">             available for use by the Realm.  --&gt;</w:t>
+        <w:br/>
+        <w:t xml:space="preserve">        &lt;Realm className="org.apache.catalina.realm.UserDatabaseRealm" resourceName="UserDatabase"/&gt;</w:t>
+        <w:br/>
+        <w:t xml:space="preserve">      &lt;/Realm&gt;</w:t>
+        <w:br/>
+        <w:br/>
+        <w:t xml:space="preserve">      &lt;Host appBase="webapps" autoDeploy="true" name="localhost" unpackWARs="true"&gt;</w:t>
+        <w:br/>
+        <w:br/>
+        <w:t xml:space="preserve">        &lt;!-- SingleSignOn valve, share authentication between web applications</w:t>
+        <w:br/>
+        <w:t xml:space="preserve">             Documentation at: /docs/config/valve.html --&gt;</w:t>
+        <w:br/>
+        <w:t xml:space="preserve">        &lt;!--</w:t>
+        <w:br/>
+        <w:t xml:space="preserve">        &lt;Valve className="org.apache.catalina.authenticator.SingleSignOn" /&gt;</w:t>
+        <w:br/>
+        <w:t xml:space="preserve">        --&gt;</w:t>
+        <w:br/>
+        <w:br/>
+        <w:t xml:space="preserve">        &lt;!-- Access log processes all example.</w:t>
+        <w:br/>
+        <w:t xml:space="preserve">             Documentation at: /docs/config/valve.html</w:t>
+        <w:br/>
+        <w:t xml:space="preserve">             Note: The pattern used is equivalent to using pattern="common" --&gt;</w:t>
+        <w:br/>
+        <w:t xml:space="preserve">        &lt;Valve className="org.apache.catalina.valves.AccessLogValve" directory="logs" pattern="%h %l %u %t &amp;quot;%r&amp;quot; %s %b" prefix="localhost_access_log" suffix=".txt"/&gt;</w:t>
+        <w:br/>
+        <w:br/>
+        <w:t xml:space="preserve">      &lt;/Host&gt;</w:t>
+        <w:br/>
+        <w:t xml:space="preserve">    &lt;/Engine&gt;</w:t>
+        <w:br/>
+        <w:t xml:space="preserve">  &lt;/Service&gt;</w:t>
+        <w:br/>
+        <w:t>&lt;/Server&gt;</w:t>
       </w:r>
     </w:p>
     <w:p>
@@ -1384,7 +1810,7 @@
         <w:rPr>
           <w:rFonts w:ascii="Times New Roman" w:hAnsi="Times New Roman"/>
         </w:rPr>
-        <w:t>Приложение Г. BookList.jsp (продолжение)</w:t>
+        <w:t>Продолжение приложения Г</w:t>
       </w:r>
     </w:p>
     <w:p>

</xml_diff>

<commit_message>
Add GitHub link to lab report
</commit_message>
<xml_diff>
--- a/docs/Opash_4314_lab6.docx
+++ b/docs/Opash_4314_lab6.docx
@@ -617,6 +617,31 @@
     </w:p>
     <w:p>
       <w:pPr>
+        <w:spacing w:after="120"/>
+        <w:ind w:firstLine="567"/>
+        <w:jc w:val="both"/>
+        <w:rPr>
+          <w:lang w:val="ru-RU"/>
+        </w:rPr>
+      </w:pPr>
+      <w:r>
+        <w:rPr>
+          <w:rFonts w:ascii="Times New Roman" w:hAnsi="Times New Roman"/>
+        </w:rPr>
+        <w:t xml:space="preserve">Репозиторий проекта: </w:t>
+      </w:r>
+      <w:hyperlink r:id="rId28">
+        <w:r>
+          <w:rPr>
+            <w:color w:val="0563C1"/>
+            <w:u w:val="single"/>
+          </w:rPr>
+          <w:t>https://github.com/opash17/web-lab6</w:t>
+        </w:r>
+      </w:hyperlink>
+    </w:p>
+    <w:p>
+      <w:pPr>
         <w:pStyle w:val="1"/>
         <w:pageBreakBefore/>
         <w:spacing w:before="280" w:after="120"/>
@@ -649,7 +674,7 @@
                     <pic:cNvPicPr/>
                   </pic:nvPicPr>
                   <pic:blipFill>
-                    <a:blip r:embed="rId28"/>
+                    <a:blip r:embed="rId29"/>
                     <a:stretch>
                       <a:fillRect/>
                     </a:stretch>
@@ -735,7 +760,7 @@
                     <pic:cNvPicPr/>
                   </pic:nvPicPr>
                   <pic:blipFill>
-                    <a:blip r:embed="rId29"/>
+                    <a:blip r:embed="rId30"/>
                     <a:stretch>
                       <a:fillRect/>
                     </a:stretch>

</xml_diff>